<commit_message>
Deploy to GCP via Github Actions
</commit_message>
<xml_diff>
--- a/backend/temp/generated_mau_giao_an_chuan.docx
+++ b/backend/temp/generated_mau_giao_an_chuan.docx
@@ -427,7 +427,7 @@
         </w:rPr>
       </w:pPr>
       <w:r>
-        <w:t>1. Kiến thức: Học sinh hiểu khái niệm tập hợp, cách viết tập hợp, các phần tử của tập hợp và cách biểu diễn tập hợp.</w:t>
+        <w:t>1. Kiến thức: Học sinh nắm vững khái niệm tập hợp, biết cách liệt kê các phần tử của tập hợp và sử dụng ký hiệu "∈", "∉".</w:t>
       </w:r>
     </w:p>
     <w:p>
@@ -439,7 +439,7 @@
         </w:rPr>
       </w:pPr>
       <w:r>
-        <w:t>2. Năng lực: Phát triển năng lực tư duy logic, năng lực giải quyết vấn đề và năng lực giao tiếp khi làm việc theo nhóm.</w:t>
+        <w:t>2. Năng lực: Học sinh phát triển năng lực tư duy logic, khả năng phân tích và tổng hợp thông tin, kỹ năng làm việc nhóm và giao tiếp.</w:t>
       </w:r>
     </w:p>
     <w:p>
@@ -451,7 +451,7 @@
         </w:rPr>
       </w:pPr>
       <w:r>
-        <w:t>3. Phẩm chất: Hình thành phẩm chất chăm chỉ, cẩn thận khi làm bài tập; trách nhiệm trong học tập và hợp tác với bạn bè.</w:t>
+        <w:t>3. Phẩm chất: Học sinh có ý thức tự giác trong học tập, kiên trì và cẩn thận khi làm bài tập.</w:t>
       </w:r>
     </w:p>
     <w:p>
@@ -484,7 +484,7 @@
         </w:rPr>
       </w:pPr>
       <w:r>
-        <w:t>Sách giáo khoa Toán 6, bảng phụ, phấn, bút dạ, giấy A4, máy chiếu (nếu có).</w:t>
+        <w:t>- Bảng trắng, bút viết, sách giáo khoa Toán lớp 6, bảng phụ, phiếu bài tập.</w:t>
       </w:r>
     </w:p>
     <w:p>
@@ -533,7 +533,7 @@
         </w:rPr>
       </w:pPr>
       <w:r>
-        <w:t>Mục tiêu: Tạo sự hứng thú và gợi mở cho học sinh về khái niệm tập hợp thông qua ví dụ thực tế.</w:t>
+        <w:t>- Mục tiêu: Khơi gợi sự tò mò, hứng thú của học sinh về khái niệm tập hợp.</w:t>
       </w:r>
     </w:p>
     <w:p>
@@ -548,7 +548,7 @@
         </w:rPr>
       </w:pPr>
       <w:r>
-        <w:t>Nội dung: Giáo viên giới thiệu một số ví dụ về tập hợp trong đời sống như tập hợp các học sinh trong lớp, tập hợp các loại trái cây.</w:t>
+        <w:t>- Nội dung: Giáo viên đưa ra một số ví dụ thực tế về tập hợp, chẳng hạn như tập hợp các đồ vật trong lớp học, tập hợp các con số trên một đồng hồ.</w:t>
       </w:r>
     </w:p>
     <w:p>
@@ -563,7 +563,7 @@
         </w:rPr>
       </w:pPr>
       <w:r>
-        <w:t>Sản phẩm: Học sinh nêu được một số ví dụ về tập hợp trong thực tế.</w:t>
+        <w:t>- Sản phẩm: Học sinh nêu được một số ví dụ về tập hợp trong đời sống hàng ngày.</w:t>
       </w:r>
     </w:p>
     <w:p>
@@ -578,7 +578,7 @@
         </w:rPr>
       </w:pPr>
       <w:r>
-        <w:t>Tổ chức thực hiện: Giáo viên đặt câu hỏi và yêu cầu học sinh thảo luận nhóm để tìm ví dụ.</w:t>
+        <w:t>- Tổ chức: Giáo viên đặt câu hỏi mở để học sinh thảo luận và trả lời.</w:t>
       </w:r>
     </w:p>
     <w:p>
@@ -611,7 +611,7 @@
         </w:rPr>
       </w:pPr>
       <w:r>
-        <w:t>Mục tiêu: Học sinh hiểu và biết cách viết các tập hợp, phần tử của tập hợp.</w:t>
+        <w:t>- Mục tiêu: Học sinh hiểu được định nghĩa, cách ghi và ký hiệu của tập hợp.</w:t>
       </w:r>
     </w:p>
     <w:p>
@@ -626,7 +626,7 @@
         </w:rPr>
       </w:pPr>
       <w:r>
-        <w:t>Nội dung: Giáo viên hướng dẫn cách viết tập hợp bằng cách liệt kê các phần tử và dùng ký hiệu.</w:t>
+        <w:t>- Nội dung: Giới thiệu khái niệm tập hợp, cách liệt kê phần tử của tập hợp, ký hiệu "∈", "∉".</w:t>
       </w:r>
     </w:p>
     <w:p>
@@ -641,7 +641,7 @@
         </w:rPr>
       </w:pPr>
       <w:r>
-        <w:t>Sản phẩm: Học sinh viết đúng các tập hợp theo yêu cầu của giáo viên.</w:t>
+        <w:t>- Sản phẩm: Học sinh có thể liệt kê phần tử của một tập hợp đơn giản và sử dụng đúng ký hiệu.</w:t>
       </w:r>
     </w:p>
     <w:p>
@@ -656,7 +656,7 @@
         </w:rPr>
       </w:pPr>
       <w:r>
-        <w:t>Tổ chức thực hiện: Giáo viên giảng dạy lý thuyết, sau đó yêu cầu học sinh thực hành viết tập hợp.</w:t>
+        <w:t>- Tổ chức: Giáo viên giảng bài kết hợp ví dụ minh họa, học sinh làm bài tập ngắn trên lớp.</w:t>
       </w:r>
     </w:p>
     <w:p>
@@ -688,7 +688,7 @@
         </w:rPr>
       </w:pPr>
       <w:r>
-        <w:t>Mục tiêu: Củng cố kiến thức về tập hợp và rèn luyện kỹ năng viết tập hợp.</w:t>
+        <w:t>- Mục tiêu: Củng cố kiến thức về tập hợp thông qua làm bài tập.</w:t>
       </w:r>
     </w:p>
     <w:p>
@@ -703,7 +703,7 @@
         </w:rPr>
       </w:pPr>
       <w:r>
-        <w:t>Nội dung: Học sinh làm bài tập về viết tập hợp và xác định phần tử của tập hợp.</w:t>
+        <w:t>- Nội dung: Làm bài tập trong sách giáo khoa và bài tập giáo viên phát.</w:t>
       </w:r>
     </w:p>
     <w:p>
@@ -718,7 +718,7 @@
         </w:rPr>
       </w:pPr>
       <w:r>
-        <w:t>Sản phẩm: Học sinh hoàn thành các bài tập trong sách giáo khoa và phiếu bài tập.</w:t>
+        <w:t>- Sản phẩm: Học sinh hoàn thành các bài tập về tập hợp, thể hiện sự hiểu biết qua các bài làm đúng.</w:t>
       </w:r>
     </w:p>
     <w:p>
@@ -733,7 +733,7 @@
         </w:rPr>
       </w:pPr>
       <w:r>
-        <w:t>Tổ chức thực hiện: Học sinh làm việc cá nhân và trao đổi bài làm với bạn bên cạnh.</w:t>
+        <w:t>- Tổ chức: Học sinh làm việc cá nhân và trao đổi nhóm để giải quyết bài tập khó.</w:t>
       </w:r>
     </w:p>
     <w:p>
@@ -767,7 +767,7 @@
         </w:rPr>
       </w:pPr>
       <w:r>
-        <w:t>Mục tiêu: Học sinh có thể vận dụng kiến thức về tập hợp vào bài toán thực tế.</w:t>
+        <w:t>- Mục tiêu: Vận dụng kiến thức tập hợp vào giải quyết vấn đề thực tế.</w:t>
       </w:r>
     </w:p>
     <w:p>
@@ -782,7 +782,7 @@
         </w:rPr>
       </w:pPr>
       <w:r>
-        <w:t>Nội dung: Học sinh thực hiện các bài tập vận dụng liên quan đến tập hợp trong các tình huống thực tế.</w:t>
+        <w:t>- Nội dung: Đặt vấn đề yêu cầu học sinh liệt kê tập hợp các số chẵn nhỏ hơn 20, tập hợp các chữ cái trong từ "VIỆT NAM".</w:t>
       </w:r>
     </w:p>
     <w:p>
@@ -798,7 +798,7 @@
         </w:rPr>
       </w:pPr>
       <w:r>
-        <w:t>Sản phẩm: Học sinh đưa ra giải pháp cho các tình huống thực tế bằng cách sử dụng khái niệm tập hợp.</w:t>
+        <w:t>- Sản phẩm: Học sinh nêu được cách liệt kê các tập hợp theo yêu cầu, sử dụng đúng ký hiệu.</w:t>
       </w:r>
     </w:p>
     <w:p>
@@ -813,7 +813,7 @@
         </w:rPr>
       </w:pPr>
       <w:r>
-        <w:t>Tổ chức thực hiện: Học sinh thảo luận nhóm và trình bày bài làm trước lớp.</w:t>
+        <w:t>- Tổ chức: Học sinh làm việc nhóm, thảo luận và đưa ra câu trả lời.</w:t>
       </w:r>
     </w:p>
     <w:sectPr>

</xml_diff>